<commit_message>
chore: update matching question source files
</commit_message>
<xml_diff>
--- a/matching_questions/work/source.docx
+++ b/matching_questions/work/source.docx
@@ -882,7 +882,7 @@
         <w:drawing>
           <wp:inline xmlns:a="http://schemas.openxmlformats.org/drawingml/2006/main" xmlns:pic="http://schemas.openxmlformats.org/drawingml/2006/picture">
             <wp:extent cx="6190488" cy="3013155"/>
-            <wp:docPr id="522" name="Picture 522"/>
+            <wp:docPr id="557" name="Picture 557"/>
             <wp:cNvGraphicFramePr>
               <a:graphicFrameLocks noChangeAspect="1"/>
             </wp:cNvGraphicFramePr>
@@ -890,11 +890,11 @@
               <a:graphicData uri="http://schemas.openxmlformats.org/drawingml/2006/picture">
                 <pic:pic>
                   <pic:nvPicPr>
-                    <pic:cNvPr id="0" name="image.png"/>
+                    <pic:cNvPr id="0" name="q01_transition_systems_vs_program_graphs.png"/>
                     <pic:cNvPicPr/>
                   </pic:nvPicPr>
                   <pic:blipFill>
-                    <a:blip r:embed="rId43"/>
+                    <a:blip r:embed="rId12"/>
                     <a:stretch>
                       <a:fillRect/>
                     </a:stretch>
@@ -2131,7 +2131,7 @@
         <w:drawing>
           <wp:inline xmlns:a="http://schemas.openxmlformats.org/drawingml/2006/main" xmlns:pic="http://schemas.openxmlformats.org/drawingml/2006/picture">
             <wp:extent cx="6190488" cy="3239935"/>
-            <wp:docPr id="523" name="Picture 523"/>
+            <wp:docPr id="592" name="Picture 592"/>
             <wp:cNvGraphicFramePr>
               <a:graphicFrameLocks noChangeAspect="1"/>
             </wp:cNvGraphicFramePr>
@@ -2143,7 +2143,7 @@
                     <pic:cNvPicPr/>
                   </pic:nvPicPr>
                   <pic:blipFill>
-                    <a:blip r:embed="rId44"/>
+                    <a:blip r:embed="rId13"/>
                     <a:stretch>
                       <a:fillRect/>
                     </a:stretch>
@@ -2935,7 +2935,7 @@
         <w:drawing>
           <wp:inline xmlns:a="http://schemas.openxmlformats.org/drawingml/2006/main" xmlns:pic="http://schemas.openxmlformats.org/drawingml/2006/picture">
             <wp:extent cx="6190488" cy="3121092"/>
-            <wp:docPr id="524" name="Picture 524"/>
+            <wp:docPr id="559" name="Picture 559"/>
             <wp:cNvGraphicFramePr>
               <a:graphicFrameLocks noChangeAspect="1"/>
             </wp:cNvGraphicFramePr>
@@ -5012,7 +5012,7 @@
         <w:drawing>
           <wp:inline xmlns:a="http://schemas.openxmlformats.org/drawingml/2006/main" xmlns:pic="http://schemas.openxmlformats.org/drawingml/2006/picture">
             <wp:extent cx="4434840" cy="3037251"/>
-            <wp:docPr id="525" name="Picture 525"/>
+            <wp:docPr id="560" name="Picture 560"/>
             <wp:cNvGraphicFramePr>
               <a:graphicFrameLocks noChangeAspect="1"/>
             </wp:cNvGraphicFramePr>
@@ -5065,7 +5065,7 @@
         <w:drawing>
           <wp:inline xmlns:a="http://schemas.openxmlformats.org/drawingml/2006/main" xmlns:pic="http://schemas.openxmlformats.org/drawingml/2006/picture">
             <wp:extent cx="4434840" cy="3037251"/>
-            <wp:docPr id="526" name="Picture 526"/>
+            <wp:docPr id="561" name="Picture 561"/>
             <wp:cNvGraphicFramePr>
               <a:graphicFrameLocks noChangeAspect="1"/>
             </wp:cNvGraphicFramePr>
@@ -5117,7 +5117,7 @@
         <w:drawing>
           <wp:inline xmlns:a="http://schemas.openxmlformats.org/drawingml/2006/main" xmlns:pic="http://schemas.openxmlformats.org/drawingml/2006/picture">
             <wp:extent cx="4434840" cy="3037251"/>
-            <wp:docPr id="527" name="Picture 527"/>
+            <wp:docPr id="562" name="Picture 562"/>
             <wp:cNvGraphicFramePr>
               <a:graphicFrameLocks noChangeAspect="1"/>
             </wp:cNvGraphicFramePr>
@@ -5170,7 +5170,7 @@
         <w:drawing>
           <wp:inline xmlns:a="http://schemas.openxmlformats.org/drawingml/2006/main" xmlns:pic="http://schemas.openxmlformats.org/drawingml/2006/picture">
             <wp:extent cx="4434840" cy="2978818"/>
-            <wp:docPr id="528" name="Picture 528"/>
+            <wp:docPr id="563" name="Picture 563"/>
             <wp:cNvGraphicFramePr>
               <a:graphicFrameLocks noChangeAspect="1"/>
             </wp:cNvGraphicFramePr>
@@ -5261,7 +5261,7 @@
         <w:drawing>
           <wp:inline xmlns:a="http://schemas.openxmlformats.org/drawingml/2006/main" xmlns:pic="http://schemas.openxmlformats.org/drawingml/2006/picture">
             <wp:extent cx="4434840" cy="2978818"/>
-            <wp:docPr id="529" name="Picture 529"/>
+            <wp:docPr id="564" name="Picture 564"/>
             <wp:cNvGraphicFramePr>
               <a:graphicFrameLocks noChangeAspect="1"/>
             </wp:cNvGraphicFramePr>
@@ -5321,7 +5321,7 @@
         <w:drawing>
           <wp:inline xmlns:a="http://schemas.openxmlformats.org/drawingml/2006/main" xmlns:pic="http://schemas.openxmlformats.org/drawingml/2006/picture">
             <wp:extent cx="4434840" cy="3037251"/>
-            <wp:docPr id="530" name="Picture 530"/>
+            <wp:docPr id="565" name="Picture 565"/>
             <wp:cNvGraphicFramePr>
               <a:graphicFrameLocks noChangeAspect="1"/>
             </wp:cNvGraphicFramePr>
@@ -5650,7 +5650,7 @@
         <w:drawing>
           <wp:inline xmlns:a="http://schemas.openxmlformats.org/drawingml/2006/main" xmlns:pic="http://schemas.openxmlformats.org/drawingml/2006/picture">
             <wp:extent cx="6190488" cy="1109630"/>
-            <wp:docPr id="531" name="Picture 531"/>
+            <wp:docPr id="566" name="Picture 566"/>
             <wp:cNvGraphicFramePr>
               <a:graphicFrameLocks noChangeAspect="1"/>
             </wp:cNvGraphicFramePr>
@@ -6188,7 +6188,7 @@
         <w:drawing>
           <wp:inline xmlns:a="http://schemas.openxmlformats.org/drawingml/2006/main" xmlns:pic="http://schemas.openxmlformats.org/drawingml/2006/picture">
             <wp:extent cx="6190488" cy="2314515"/>
-            <wp:docPr id="532" name="Picture 532"/>
+            <wp:docPr id="567" name="Picture 567"/>
             <wp:cNvGraphicFramePr>
               <a:graphicFrameLocks noChangeAspect="1"/>
             </wp:cNvGraphicFramePr>
@@ -6528,7 +6528,7 @@
         <w:drawing>
           <wp:inline xmlns:a="http://schemas.openxmlformats.org/drawingml/2006/main" xmlns:pic="http://schemas.openxmlformats.org/drawingml/2006/picture">
             <wp:extent cx="4434840" cy="2995191"/>
-            <wp:docPr id="533" name="Picture 533"/>
+            <wp:docPr id="568" name="Picture 568"/>
             <wp:cNvGraphicFramePr>
               <a:graphicFrameLocks noChangeAspect="1"/>
             </wp:cNvGraphicFramePr>
@@ -6585,7 +6585,7 @@
         <w:drawing>
           <wp:inline xmlns:a="http://schemas.openxmlformats.org/drawingml/2006/main" xmlns:pic="http://schemas.openxmlformats.org/drawingml/2006/picture">
             <wp:extent cx="4434840" cy="2995191"/>
-            <wp:docPr id="534" name="Picture 534"/>
+            <wp:docPr id="569" name="Picture 569"/>
             <wp:cNvGraphicFramePr>
               <a:graphicFrameLocks noChangeAspect="1"/>
             </wp:cNvGraphicFramePr>
@@ -6643,7 +6643,7 @@
         <w:drawing>
           <wp:inline xmlns:a="http://schemas.openxmlformats.org/drawingml/2006/main" xmlns:pic="http://schemas.openxmlformats.org/drawingml/2006/picture">
             <wp:extent cx="4434840" cy="2995191"/>
-            <wp:docPr id="535" name="Picture 535"/>
+            <wp:docPr id="570" name="Picture 570"/>
             <wp:cNvGraphicFramePr>
               <a:graphicFrameLocks noChangeAspect="1"/>
             </wp:cNvGraphicFramePr>
@@ -6702,7 +6702,7 @@
         <w:drawing>
           <wp:inline xmlns:a="http://schemas.openxmlformats.org/drawingml/2006/main" xmlns:pic="http://schemas.openxmlformats.org/drawingml/2006/picture">
             <wp:extent cx="4434840" cy="2995191"/>
-            <wp:docPr id="536" name="Picture 536"/>
+            <wp:docPr id="571" name="Picture 571"/>
             <wp:cNvGraphicFramePr>
               <a:graphicFrameLocks noChangeAspect="1"/>
             </wp:cNvGraphicFramePr>
@@ -6800,7 +6800,7 @@
         <w:drawing>
           <wp:inline xmlns:a="http://schemas.openxmlformats.org/drawingml/2006/main" xmlns:pic="http://schemas.openxmlformats.org/drawingml/2006/picture">
             <wp:extent cx="4434840" cy="2995191"/>
-            <wp:docPr id="537" name="Picture 537"/>
+            <wp:docPr id="572" name="Picture 572"/>
             <wp:cNvGraphicFramePr>
               <a:graphicFrameLocks noChangeAspect="1"/>
             </wp:cNvGraphicFramePr>
@@ -6858,7 +6858,7 @@
         <w:drawing>
           <wp:inline xmlns:a="http://schemas.openxmlformats.org/drawingml/2006/main" xmlns:pic="http://schemas.openxmlformats.org/drawingml/2006/picture">
             <wp:extent cx="4434840" cy="2995191"/>
-            <wp:docPr id="538" name="Picture 538"/>
+            <wp:docPr id="573" name="Picture 573"/>
             <wp:cNvGraphicFramePr>
               <a:graphicFrameLocks noChangeAspect="1"/>
             </wp:cNvGraphicFramePr>
@@ -7288,7 +7288,7 @@
         <w:drawing>
           <wp:inline xmlns:a="http://schemas.openxmlformats.org/drawingml/2006/main" xmlns:pic="http://schemas.openxmlformats.org/drawingml/2006/picture">
             <wp:extent cx="6190488" cy="2580861"/>
-            <wp:docPr id="539" name="Picture 539"/>
+            <wp:docPr id="574" name="Picture 574"/>
             <wp:cNvGraphicFramePr>
               <a:graphicFrameLocks noChangeAspect="1"/>
             </wp:cNvGraphicFramePr>
@@ -9345,7 +9345,7 @@
         <w:drawing>
           <wp:inline xmlns:a="http://schemas.openxmlformats.org/drawingml/2006/main" xmlns:pic="http://schemas.openxmlformats.org/drawingml/2006/picture">
             <wp:extent cx="6190488" cy="3418237"/>
-            <wp:docPr id="540" name="Picture 540"/>
+            <wp:docPr id="575" name="Picture 575"/>
             <wp:cNvGraphicFramePr>
               <a:graphicFrameLocks noChangeAspect="1"/>
             </wp:cNvGraphicFramePr>
@@ -11432,7 +11432,7 @@
         <w:drawing>
           <wp:inline xmlns:a="http://schemas.openxmlformats.org/drawingml/2006/main" xmlns:pic="http://schemas.openxmlformats.org/drawingml/2006/picture">
             <wp:extent cx="6190488" cy="1554957"/>
-            <wp:docPr id="541" name="Picture 541"/>
+            <wp:docPr id="576" name="Picture 576"/>
             <wp:cNvGraphicFramePr>
               <a:graphicFrameLocks noChangeAspect="1"/>
             </wp:cNvGraphicFramePr>
@@ -11609,7 +11609,7 @@
         <w:drawing>
           <wp:inline xmlns:a="http://schemas.openxmlformats.org/drawingml/2006/main" xmlns:pic="http://schemas.openxmlformats.org/drawingml/2006/picture">
             <wp:extent cx="6190488" cy="2333575"/>
-            <wp:docPr id="542" name="Picture 542"/>
+            <wp:docPr id="577" name="Picture 577"/>
             <wp:cNvGraphicFramePr>
               <a:graphicFrameLocks noChangeAspect="1"/>
             </wp:cNvGraphicFramePr>
@@ -11813,7 +11813,7 @@
         <w:drawing>
           <wp:inline xmlns:a="http://schemas.openxmlformats.org/drawingml/2006/main" xmlns:pic="http://schemas.openxmlformats.org/drawingml/2006/picture">
             <wp:extent cx="3977639" cy="2218499"/>
-            <wp:docPr id="543" name="Picture 543"/>
+            <wp:docPr id="578" name="Picture 578"/>
             <wp:cNvGraphicFramePr>
               <a:graphicFrameLocks noChangeAspect="1"/>
             </wp:cNvGraphicFramePr>
@@ -11869,7 +11869,7 @@
         <w:drawing>
           <wp:inline xmlns:a="http://schemas.openxmlformats.org/drawingml/2006/main" xmlns:pic="http://schemas.openxmlformats.org/drawingml/2006/picture">
             <wp:extent cx="3977639" cy="2218499"/>
-            <wp:docPr id="544" name="Picture 544"/>
+            <wp:docPr id="579" name="Picture 579"/>
             <wp:cNvGraphicFramePr>
               <a:graphicFrameLocks noChangeAspect="1"/>
             </wp:cNvGraphicFramePr>
@@ -11964,7 +11964,7 @@
         <w:drawing>
           <wp:inline xmlns:a="http://schemas.openxmlformats.org/drawingml/2006/main" xmlns:pic="http://schemas.openxmlformats.org/drawingml/2006/picture">
             <wp:extent cx="3977639" cy="2218499"/>
-            <wp:docPr id="545" name="Picture 545"/>
+            <wp:docPr id="580" name="Picture 580"/>
             <wp:cNvGraphicFramePr>
               <a:graphicFrameLocks noChangeAspect="1"/>
             </wp:cNvGraphicFramePr>
@@ -12026,7 +12026,7 @@
         <w:drawing>
           <wp:inline xmlns:a="http://schemas.openxmlformats.org/drawingml/2006/main" xmlns:pic="http://schemas.openxmlformats.org/drawingml/2006/picture">
             <wp:extent cx="3977639" cy="2218499"/>
-            <wp:docPr id="546" name="Picture 546"/>
+            <wp:docPr id="581" name="Picture 581"/>
             <wp:cNvGraphicFramePr>
               <a:graphicFrameLocks noChangeAspect="1"/>
             </wp:cNvGraphicFramePr>
@@ -12126,7 +12126,7 @@
         <w:drawing>
           <wp:inline xmlns:a="http://schemas.openxmlformats.org/drawingml/2006/main" xmlns:pic="http://schemas.openxmlformats.org/drawingml/2006/picture">
             <wp:extent cx="3977639" cy="2604779"/>
-            <wp:docPr id="547" name="Picture 547"/>
+            <wp:docPr id="582" name="Picture 582"/>
             <wp:cNvGraphicFramePr>
               <a:graphicFrameLocks noChangeAspect="1"/>
             </wp:cNvGraphicFramePr>
@@ -12183,7 +12183,7 @@
         <w:drawing>
           <wp:inline xmlns:a="http://schemas.openxmlformats.org/drawingml/2006/main" xmlns:pic="http://schemas.openxmlformats.org/drawingml/2006/picture">
             <wp:extent cx="3977639" cy="2218499"/>
-            <wp:docPr id="548" name="Picture 548"/>
+            <wp:docPr id="583" name="Picture 583"/>
             <wp:cNvGraphicFramePr>
               <a:graphicFrameLocks noChangeAspect="1"/>
             </wp:cNvGraphicFramePr>
@@ -12371,6 +12371,45 @@
           <w:lang w:bidi="he-IL"/>
         </w:rPr>
         <w:t>:</w:t>
+      </w:r>
+    </w:p>
+    <w:p>
+      <w:pPr>
+        <w:jc w:val="center"/>
+      </w:pPr>
+      <w:r>
+        <w:drawing>
+          <wp:inline xmlns:a="http://schemas.openxmlformats.org/drawingml/2006/main" xmlns:pic="http://schemas.openxmlformats.org/drawingml/2006/picture">
+            <wp:extent cx="6190488" cy="2366297"/>
+            <wp:docPr id="584" name="Picture 584"/>
+            <wp:cNvGraphicFramePr>
+              <a:graphicFrameLocks noChangeAspect="1"/>
+            </wp:cNvGraphicFramePr>
+            <a:graphic>
+              <a:graphicData uri="http://schemas.openxmlformats.org/drawingml/2006/picture">
+                <pic:pic>
+                  <pic:nvPicPr>
+                    <pic:cNvPr id="0" name="image.png"/>
+                    <pic:cNvPicPr/>
+                  </pic:nvPicPr>
+                  <pic:blipFill>
+                    <a:blip r:embed="rId70"/>
+                    <a:stretch>
+                      <a:fillRect/>
+                    </a:stretch>
+                  </pic:blipFill>
+                  <pic:spPr>
+                    <a:xfrm>
+                      <a:off x="0" y="0"/>
+                      <a:ext cx="6190488" cy="2366297"/>
+                    </a:xfrm>
+                    <a:prstGeom prst="rect"/>
+                  </pic:spPr>
+                </pic:pic>
+              </a:graphicData>
+            </a:graphic>
+          </wp:inline>
+        </w:drawing>
       </w:r>
     </w:p>
     <w:p>
@@ -12436,7 +12475,7 @@
         <w:drawing>
           <wp:inline xmlns:a="http://schemas.openxmlformats.org/drawingml/2006/main" xmlns:pic="http://schemas.openxmlformats.org/drawingml/2006/picture">
             <wp:extent cx="6190488" cy="2629714"/>
-            <wp:docPr id="550" name="Picture 550"/>
+            <wp:docPr id="585" name="Picture 585"/>
             <wp:cNvGraphicFramePr>
               <a:graphicFrameLocks noChangeAspect="1"/>
             </wp:cNvGraphicFramePr>
@@ -12668,7 +12707,7 @@
         <w:drawing>
           <wp:inline xmlns:a="http://schemas.openxmlformats.org/drawingml/2006/main" xmlns:pic="http://schemas.openxmlformats.org/drawingml/2006/picture">
             <wp:extent cx="3977639" cy="2096579"/>
-            <wp:docPr id="551" name="Picture 551"/>
+            <wp:docPr id="586" name="Picture 586"/>
             <wp:cNvGraphicFramePr>
               <a:graphicFrameLocks noChangeAspect="1"/>
             </wp:cNvGraphicFramePr>
@@ -12676,7 +12715,7 @@
               <a:graphicData uri="http://schemas.openxmlformats.org/drawingml/2006/picture">
                 <pic:pic>
                   <pic:nvPicPr>
-                    <pic:cNvPr id="0" name="q10_option_a.png"/>
+                    <pic:cNvPr id="0" name="image.png"/>
                     <pic:cNvPicPr/>
                   </pic:nvPicPr>
                   <pic:blipFill>
@@ -12723,7 +12762,7 @@
         <w:drawing>
           <wp:inline xmlns:a="http://schemas.openxmlformats.org/drawingml/2006/main" xmlns:pic="http://schemas.openxmlformats.org/drawingml/2006/picture">
             <wp:extent cx="3977639" cy="2255216"/>
-            <wp:docPr id="552" name="Picture 552"/>
+            <wp:docPr id="587" name="Picture 587"/>
             <wp:cNvGraphicFramePr>
               <a:graphicFrameLocks noChangeAspect="1"/>
             </wp:cNvGraphicFramePr>
@@ -12731,7 +12770,7 @@
               <a:graphicData uri="http://schemas.openxmlformats.org/drawingml/2006/picture">
                 <pic:pic>
                   <pic:nvPicPr>
-                    <pic:cNvPr id="0" name="q10_option_b.png"/>
+                    <pic:cNvPr id="0" name="image.png"/>
                     <pic:cNvPicPr/>
                   </pic:nvPicPr>
                   <pic:blipFill>
@@ -12779,7 +12818,7 @@
         <w:drawing>
           <wp:inline xmlns:a="http://schemas.openxmlformats.org/drawingml/2006/main" xmlns:pic="http://schemas.openxmlformats.org/drawingml/2006/picture">
             <wp:extent cx="3977639" cy="2255216"/>
-            <wp:docPr id="553" name="Picture 553"/>
+            <wp:docPr id="588" name="Picture 588"/>
             <wp:cNvGraphicFramePr>
               <a:graphicFrameLocks noChangeAspect="1"/>
             </wp:cNvGraphicFramePr>
@@ -12787,7 +12826,7 @@
               <a:graphicData uri="http://schemas.openxmlformats.org/drawingml/2006/picture">
                 <pic:pic>
                   <pic:nvPicPr>
-                    <pic:cNvPr id="0" name="q10_option_c.png"/>
+                    <pic:cNvPr id="0" name="image.png"/>
                     <pic:cNvPicPr/>
                   </pic:nvPicPr>
                   <pic:blipFill>
@@ -12831,7 +12870,7 @@
         <w:drawing>
           <wp:inline xmlns:a="http://schemas.openxmlformats.org/drawingml/2006/main" xmlns:pic="http://schemas.openxmlformats.org/drawingml/2006/picture">
             <wp:extent cx="3977639" cy="2255216"/>
-            <wp:docPr id="554" name="Picture 554"/>
+            <wp:docPr id="589" name="Picture 589"/>
             <wp:cNvGraphicFramePr>
               <a:graphicFrameLocks noChangeAspect="1"/>
             </wp:cNvGraphicFramePr>
@@ -12839,7 +12878,7 @@
               <a:graphicData uri="http://schemas.openxmlformats.org/drawingml/2006/picture">
                 <pic:pic>
                   <pic:nvPicPr>
-                    <pic:cNvPr id="0" name="q10_option_d.png"/>
+                    <pic:cNvPr id="0" name="image.png"/>
                     <pic:cNvPicPr/>
                   </pic:nvPicPr>
                   <pic:blipFill>
@@ -12921,7 +12960,7 @@
         <w:drawing>
           <wp:inline xmlns:a="http://schemas.openxmlformats.org/drawingml/2006/main" xmlns:pic="http://schemas.openxmlformats.org/drawingml/2006/picture">
             <wp:extent cx="3977639" cy="2096579"/>
-            <wp:docPr id="555" name="Picture 555"/>
+            <wp:docPr id="590" name="Picture 590"/>
             <wp:cNvGraphicFramePr>
               <a:graphicFrameLocks noChangeAspect="1"/>
             </wp:cNvGraphicFramePr>
@@ -12929,7 +12968,7 @@
               <a:graphicData uri="http://schemas.openxmlformats.org/drawingml/2006/picture">
                 <pic:pic>
                   <pic:nvPicPr>
-                    <pic:cNvPr id="0" name="q10_option_e.png"/>
+                    <pic:cNvPr id="0" name="image.png"/>
                     <pic:cNvPicPr/>
                   </pic:nvPicPr>
                   <pic:blipFill>
@@ -12977,7 +13016,7 @@
         <w:drawing>
           <wp:inline xmlns:a="http://schemas.openxmlformats.org/drawingml/2006/main" xmlns:pic="http://schemas.openxmlformats.org/drawingml/2006/picture">
             <wp:extent cx="3977639" cy="2308088"/>
-            <wp:docPr id="556" name="Picture 556"/>
+            <wp:docPr id="591" name="Picture 591"/>
             <wp:cNvGraphicFramePr>
               <a:graphicFrameLocks noChangeAspect="1"/>
             </wp:cNvGraphicFramePr>
@@ -12985,7 +13024,7 @@
               <a:graphicData uri="http://schemas.openxmlformats.org/drawingml/2006/picture">
                 <pic:pic>
                   <pic:nvPicPr>
-                    <pic:cNvPr id="0" name="q10_option_f.png"/>
+                    <pic:cNvPr id="0" name="image.png"/>
                     <pic:cNvPicPr/>
                   </pic:nvPicPr>
                   <pic:blipFill>

</xml_diff>